<commit_message>
Polish Unit 7 discussion: strengthen tuple connection in enumerate section, add unifying intro sentence
</commit_message>
<xml_diff>
--- a/CS1101_Programming_Fundamentals/Unit7_Dictionaries_Tuples/Discussion/Unit7_Discussion_Assignment.docx
+++ b/CS1101_Programming_Fundamentals/Unit7_Dictionaries_Tuples/Discussion/Unit7_Discussion_Assignment.docx
@@ -173,7 +173,80 @@
           <w:rFonts w:ascii="Times New Roman" w:hAnsi="Times New Roman"/>
           <w:sz w:val="24"/>
         </w:rPr>
-        <w:t xml:space="preserve">(p. 121). This post demonstrates all three tools —</w:t>
+        <w:t xml:space="preserve">(p. 121). Each of the three tools covered below —</w:t>
+      </w:r>
+      <w:r>
+        <w:rPr>
+          <w:rFonts w:ascii="Times New Roman" w:hAnsi="Times New Roman"/>
+          <w:sz w:val="24"/>
+        </w:rPr>
+        <w:t xml:space="preserve"> </w:t>
+      </w:r>
+      <w:r>
+        <w:rPr>
+          <w:rStyle w:val="VerbatimChar"/>
+          <w:rFonts w:ascii="Times New Roman" w:hAnsi="Times New Roman"/>
+          <w:sz w:val="24"/>
+        </w:rPr>
+        <w:t xml:space="preserve">zip</w:t>
+      </w:r>
+      <w:r>
+        <w:rPr>
+          <w:rFonts w:ascii="Times New Roman" w:hAnsi="Times New Roman"/>
+          <w:sz w:val="24"/>
+        </w:rPr>
+        <w:t xml:space="preserve">,</w:t>
+      </w:r>
+      <w:r>
+        <w:rPr>
+          <w:rFonts w:ascii="Times New Roman" w:hAnsi="Times New Roman"/>
+          <w:sz w:val="24"/>
+        </w:rPr>
+        <w:t xml:space="preserve"> </w:t>
+      </w:r>
+      <w:r>
+        <w:rPr>
+          <w:rStyle w:val="VerbatimChar"/>
+          <w:rFonts w:ascii="Times New Roman" w:hAnsi="Times New Roman"/>
+          <w:sz w:val="24"/>
+        </w:rPr>
+        <w:t xml:space="preserve">enumerate</w:t>
+      </w:r>
+      <w:r>
+        <w:rPr>
+          <w:rFonts w:ascii="Times New Roman" w:hAnsi="Times New Roman"/>
+          <w:sz w:val="24"/>
+        </w:rPr>
+        <w:t xml:space="preserve">, and</w:t>
+      </w:r>
+      <w:r>
+        <w:rPr>
+          <w:rFonts w:ascii="Times New Roman" w:hAnsi="Times New Roman"/>
+          <w:sz w:val="24"/>
+        </w:rPr>
+        <w:t xml:space="preserve"> </w:t>
+      </w:r>
+      <w:r>
+        <w:rPr>
+          <w:rStyle w:val="VerbatimChar"/>
+          <w:rFonts w:ascii="Times New Roman" w:hAnsi="Times New Roman"/>
+          <w:sz w:val="24"/>
+        </w:rPr>
+        <w:t xml:space="preserve">.items()</w:t>
+      </w:r>
+      <w:r>
+        <w:rPr>
+          <w:rFonts w:ascii="Times New Roman" w:hAnsi="Times New Roman"/>
+          <w:sz w:val="24"/>
+        </w:rPr>
+        <w:t xml:space="preserve"> </w:t>
+      </w:r>
+      <w:r>
+        <w:rPr>
+          <w:rFonts w:ascii="Times New Roman" w:hAnsi="Times New Roman"/>
+          <w:sz w:val="24"/>
+        </w:rPr>
+        <w:t xml:space="preserve">— works by producing tuples that are immediately unpacked in the loop header, making tuple assignment central to how they operate. This post demonstrates all three tools —</w:t>
       </w:r>
       <w:r>
         <w:rPr>
@@ -1674,7 +1747,94 @@
           <w:rFonts w:ascii="Times New Roman" w:hAnsi="Times New Roman"/>
           <w:sz w:val="24"/>
         </w:rPr>
-        <w:t xml:space="preserve">makes the intent clearer — we want both the position and the value — and eliminates the risk of off-by-one errors when the start index matters (Downey, 2015, p. 122).</w:t>
+        <w:t xml:space="preserve">makes the intent clearer — we want both the position and the value — and eliminates the risk of off-by-one errors when the start index matters (Downey, 2015, p. 122). Crucially, the</w:t>
+      </w:r>
+      <w:r>
+        <w:rPr>
+          <w:rFonts w:ascii="Times New Roman" w:hAnsi="Times New Roman"/>
+          <w:sz w:val="24"/>
+        </w:rPr>
+        <w:t xml:space="preserve"> </w:t>
+      </w:r>
+      <w:r>
+        <w:rPr>
+          <w:rStyle w:val="VerbatimChar"/>
+          <w:rFonts w:ascii="Times New Roman" w:hAnsi="Times New Roman"/>
+          <w:sz w:val="24"/>
+        </w:rPr>
+        <w:t xml:space="preserve">(index, course)</w:t>
+      </w:r>
+      <w:r>
+        <w:rPr>
+          <w:rFonts w:ascii="Times New Roman" w:hAnsi="Times New Roman"/>
+          <w:sz w:val="24"/>
+        </w:rPr>
+        <w:t xml:space="preserve"> </w:t>
+      </w:r>
+      <w:r>
+        <w:rPr>
+          <w:rFonts w:ascii="Times New Roman" w:hAnsi="Times New Roman"/>
+          <w:sz w:val="24"/>
+        </w:rPr>
+        <w:t xml:space="preserve">pair yielded on each iteration is a tuple — the same tuple assignment mechanism that makes</w:t>
+      </w:r>
+      <w:r>
+        <w:rPr>
+          <w:rFonts w:ascii="Times New Roman" w:hAnsi="Times New Roman"/>
+          <w:sz w:val="24"/>
+        </w:rPr>
+        <w:t xml:space="preserve"> </w:t>
+      </w:r>
+      <w:r>
+        <w:rPr>
+          <w:rStyle w:val="VerbatimChar"/>
+          <w:rFonts w:ascii="Times New Roman" w:hAnsi="Times New Roman"/>
+          <w:sz w:val="24"/>
+        </w:rPr>
+        <w:t xml:space="preserve">zip</w:t>
+      </w:r>
+      <w:r>
+        <w:rPr>
+          <w:rFonts w:ascii="Times New Roman" w:hAnsi="Times New Roman"/>
+          <w:sz w:val="24"/>
+        </w:rPr>
+        <w:t xml:space="preserve"> </w:t>
+      </w:r>
+      <w:r>
+        <w:rPr>
+          <w:rFonts w:ascii="Times New Roman" w:hAnsi="Times New Roman"/>
+          <w:sz w:val="24"/>
+        </w:rPr>
+        <w:t xml:space="preserve">and</w:t>
+      </w:r>
+      <w:r>
+        <w:rPr>
+          <w:rFonts w:ascii="Times New Roman" w:hAnsi="Times New Roman"/>
+          <w:sz w:val="24"/>
+        </w:rPr>
+        <w:t xml:space="preserve"> </w:t>
+      </w:r>
+      <w:r>
+        <w:rPr>
+          <w:rStyle w:val="VerbatimChar"/>
+          <w:rFonts w:ascii="Times New Roman" w:hAnsi="Times New Roman"/>
+          <w:sz w:val="24"/>
+        </w:rPr>
+        <w:t xml:space="preserve">.items()</w:t>
+      </w:r>
+      <w:r>
+        <w:rPr>
+          <w:rFonts w:ascii="Times New Roman" w:hAnsi="Times New Roman"/>
+          <w:sz w:val="24"/>
+        </w:rPr>
+        <w:t xml:space="preserve"> </w:t>
+      </w:r>
+      <w:r>
+        <w:rPr>
+          <w:rFonts w:ascii="Times New Roman" w:hAnsi="Times New Roman"/>
+          <w:sz w:val="24"/>
+        </w:rPr>
+        <w:t xml:space="preserve">work.</w:t>
       </w:r>
     </w:p>
     <w:p>
@@ -2719,7 +2879,7 @@
           <w:rFonts w:ascii="Times New Roman" w:hAnsi="Times New Roman"/>
           <w:sz w:val="24"/>
         </w:rPr>
-        <w:t xml:space="preserve">: ~530 words</w:t>
+        <w:t xml:space="preserve">: ~560 words</w:t>
       </w:r>
     </w:p>
     <w:bookmarkEnd w:id="14"/>

</xml_diff>